<commit_message>
Update project stack to CodeIgniter 4 and remove Bootstrap
</commit_message>
<xml_diff>
--- a/public/downloads/Sean_Villanueva_Portfolio.docx
+++ b/public/downloads/Sean_Villanueva_Portfolio.docx
@@ -478,7 +478,7 @@
               <w:rPr>
                 <w:rFonts w:ascii="Arial" w:cs="Arial" w:eastAsia="Arial" w:hAnsi="Arial"/>
               </w:rPr>
-              <w:t xml:space="preserve">PHP, CodeIgniter 3, and MySQL</w:t>
+              <w:t xml:space="preserve">PHP, CodeIgniter 4, and MySQL</w:t>
             </w:r>
           </w:p>
         </w:tc>
@@ -540,7 +540,7 @@
               <w:rPr>
                 <w:rFonts w:ascii="Arial" w:cs="Arial" w:eastAsia="Arial" w:hAnsi="Arial"/>
               </w:rPr>
-              <w:t xml:space="preserve">HTML, CSS, Bootstrap, JavaScript, and jQuery/AJAX</w:t>
+              <w:t xml:space="preserve">HTML, CSS, JavaScript, and jQuery/AJAX</w:t>
             </w:r>
           </w:p>
         </w:tc>

</xml_diff>

<commit_message>
Align Word downloads with supplied formats and latest profile
</commit_message>
<xml_diff>
--- a/public/downloads/Sean_Villanueva_Portfolio.docx
+++ b/public/downloads/Sean_Villanueva_Portfolio.docx
@@ -79,6 +79,8 @@
           <w:szCs w:val="19"/>
         </w:rPr>
         <w:t xml:space="preserve">villanuevasean0918@gmail.com   |   09472401814</w:t>
+        <w:br/>
+        <w:t>Santa Maria, Bulacan, Philippines  |  Expected graduation: May 2027</w:t>
       </w:r>
     </w:p>
     <w:p>
@@ -392,6 +394,8 @@
           <w:rFonts w:ascii="Arial" w:cs="Arial" w:eastAsia="Arial" w:hAnsi="Arial"/>
         </w:rPr>
         <w:t xml:space="preserve">I contribute as a web developer to this team project, working on both the front end and back end. The system covers point-of-sale and inventory management for Pharxmaco Drugstore and includes sales forecasting in its project scope.</w:t>
+        <w:br/>
+        <w:t>Live project: https://silver-fly-191014.hostingersite.com/</w:t>
       </w:r>
     </w:p>
     <w:p>

</xml_diff>

<commit_message>
Add cashier project login and latest portfolio updates
</commit_message>
<xml_diff>
--- a/public/downloads/Sean_Villanueva_Portfolio.docx
+++ b/public/downloads/Sean_Villanueva_Portfolio.docx
@@ -4,62 +4,61 @@
   <w:body>
     <w:p>
       <w:pPr>
-        <w:spacing w:after="40"/>
-      </w:pPr>
-      <w:r>
-        <w:rPr>
-          <w:rFonts w:ascii="Arial" w:cs="Arial" w:eastAsia="Arial" w:hAnsi="Arial"/>
+        <w:spacing w:after="40" w:line="240" w:lineRule="auto" w:before="0"/>
+      </w:pPr>
+      <w:r>
+        <w:rPr>
+          <w:rFonts w:ascii="Times New Roman" w:cs="Times New Roman" w:eastAsia="Times New Roman" w:hAnsi="Times New Roman"/>
           <w:b/>
           <w:bCs/>
           <w:color w:val="595959"/>
           <w:spacing w:val="60"/>
-          <w:sz w:val="20"/>
-          <w:szCs w:val="20"/>
+          <w:sz w:val="24"/>
+          <w:szCs w:val="24"/>
         </w:rPr>
         <w:t xml:space="preserve">PROJECT PORTFOLIO</w:t>
       </w:r>
     </w:p>
     <w:p>
       <w:pPr>
-        <w:spacing w:after="60"/>
-      </w:pPr>
-      <w:r>
-        <w:rPr>
-          <w:rFonts w:ascii="Arial" w:cs="Arial" w:eastAsia="Arial" w:hAnsi="Arial"/>
+        <w:spacing w:after="60" w:line="240" w:lineRule="auto" w:before="0"/>
+      </w:pPr>
+      <w:r>
+        <w:rPr>
+          <w:rFonts w:ascii="Times New Roman" w:cs="Times New Roman" w:eastAsia="Times New Roman" w:hAnsi="Times New Roman"/>
           <w:b/>
           <w:bCs/>
           <w:color w:val="000000"/>
-          <w:sz w:val="40"/>
-          <w:szCs w:val="40"/>
+          <w:sz w:val="24"/>
+          <w:szCs w:val="24"/>
         </w:rPr>
         <w:t xml:space="preserve">Pharmacy System</w:t>
       </w:r>
     </w:p>
     <w:p>
       <w:pPr>
-        <w:spacing w:after="20"/>
-      </w:pPr>
-      <w:r>
-        <w:rPr>
-          <w:rFonts w:ascii="Arial" w:cs="Arial" w:eastAsia="Arial" w:hAnsi="Arial"/>
+        <w:spacing w:after="20" w:line="240" w:lineRule="auto" w:before="0"/>
+      </w:pPr>
+      <w:r>
+        <w:rPr>
+          <w:rFonts w:ascii="Times New Roman" w:hAnsi="Times New Roman" w:eastAsia="Times New Roman" w:cs="Times New Roman"/>
           <w:b/>
-          <w:bCs/>
-          <w:sz w:val="24"/>
-          <w:szCs w:val="24"/>
-        </w:rPr>
-        <w:t xml:space="preserve">Sean Villanueva</w:t>
-      </w:r>
-    </w:p>
-    <w:p>
-      <w:pPr>
-        <w:spacing w:after="20"/>
-      </w:pPr>
-      <w:r>
-        <w:rPr>
-          <w:rFonts w:ascii="Arial" w:cs="Arial" w:eastAsia="Arial" w:hAnsi="Arial"/>
+          <w:sz w:val="24"/>
+          <w:szCs w:val="24"/>
+        </w:rPr>
+        <w:t>Sean Warren M. Villanueva</w:t>
+      </w:r>
+    </w:p>
+    <w:p>
+      <w:pPr>
+        <w:spacing w:after="20" w:line="240" w:lineRule="auto" w:before="0"/>
+      </w:pPr>
+      <w:r>
+        <w:rPr>
+          <w:rFonts w:ascii="Times New Roman" w:cs="Times New Roman" w:eastAsia="Times New Roman" w:hAnsi="Times New Roman"/>
           <w:color w:val="595959"/>
-          <w:sz w:val="19"/>
-          <w:szCs w:val="19"/>
+          <w:sz w:val="24"/>
+          <w:szCs w:val="24"/>
         </w:rPr>
         <w:t xml:space="preserve">BSIS 4-1  |  Immaculate Conception I-College of Arts and Technology</w:t>
       </w:r>
@@ -69,14 +68,14 @@
         <w:pBdr>
           <w:bottom w:val="single" w:color="000000" w:sz="12" w:space="6"/>
         </w:pBdr>
-        <w:spacing w:after="0"/>
-      </w:pPr>
-      <w:r>
-        <w:rPr>
-          <w:rFonts w:ascii="Arial" w:cs="Arial" w:eastAsia="Arial" w:hAnsi="Arial"/>
+        <w:spacing w:after="20" w:line="240" w:lineRule="auto" w:before="0"/>
+      </w:pPr>
+      <w:r>
+        <w:rPr>
+          <w:rFonts w:ascii="Times New Roman" w:cs="Times New Roman" w:eastAsia="Times New Roman" w:hAnsi="Times New Roman"/>
           <w:color w:val="595959"/>
-          <w:sz w:val="19"/>
-          <w:szCs w:val="19"/>
+          <w:sz w:val="24"/>
+          <w:szCs w:val="24"/>
         </w:rPr>
         <w:t xml:space="preserve">villanuevasean0918@gmail.com   |   09472401814</w:t>
         <w:br/>
@@ -86,25 +85,31 @@
     <w:p>
       <w:pPr>
         <w:pStyle w:val="Heading1"/>
-      </w:pPr>
-      <w:r>
-        <w:rPr>
-          <w:rFonts w:ascii="Arial" w:cs="Arial" w:eastAsia="Arial" w:hAnsi="Arial"/>
+        <w:keepNext/>
+        <w:spacing w:line="240" w:lineRule="auto" w:before="180" w:after="80"/>
+      </w:pPr>
+      <w:r>
+        <w:rPr>
+          <w:rFonts w:ascii="Times New Roman" w:cs="Times New Roman" w:eastAsia="Times New Roman" w:hAnsi="Times New Roman"/>
+          <w:b/>
+          <w:sz w:val="24"/>
+          <w:szCs w:val="24"/>
         </w:rPr>
         <w:t xml:space="preserve">Project Overview</w:t>
       </w:r>
     </w:p>
     <w:p>
       <w:pPr>
-        <w:spacing w:after="100"/>
-      </w:pPr>
-      <w:r>
-        <w:rPr>
-          <w:rFonts w:ascii="Arial" w:cs="Arial" w:eastAsia="Arial" w:hAnsi="Arial"/>
+        <w:keepNext/>
+        <w:spacing w:after="80" w:line="240" w:lineRule="auto" w:before="0"/>
+      </w:pPr>
+      <w:r>
+        <w:rPr>
+          <w:rFonts w:ascii="Times New Roman" w:cs="Times New Roman" w:eastAsia="Times New Roman" w:hAnsi="Times New Roman"/>
           <w:b/>
           <w:bCs/>
-          <w:sz w:val="23"/>
-          <w:szCs w:val="23"/>
+          <w:sz w:val="24"/>
+          <w:szCs w:val="24"/>
         </w:rPr>
         <w:t xml:space="preserve">Development of an Online Point of Sale and Inventory System for Pharxmaco Drugstore with Sales Forecasting</w:t>
       </w:r>
@@ -145,14 +150,16 @@
           </w:tcPr>
           <w:p>
             <w:pPr>
-              <w:spacing w:after="0"/>
+              <w:spacing w:after="0" w:line="240" w:lineRule="auto" w:before="0"/>
             </w:pPr>
             <w:r>
               <w:rPr>
-                <w:rFonts w:ascii="Arial" w:cs="Arial" w:eastAsia="Arial" w:hAnsi="Arial"/>
+                <w:rFonts w:ascii="Times New Roman" w:cs="Times New Roman" w:eastAsia="Times New Roman" w:hAnsi="Times New Roman"/>
                 <w:b/>
                 <w:bCs/>
                 <w:color w:val="000000"/>
+                <w:sz w:val="24"/>
+                <w:szCs w:val="24"/>
               </w:rPr>
               <w:t xml:space="preserve">Role</w:t>
             </w:r>
@@ -176,11 +183,13 @@
           </w:tcPr>
           <w:p>
             <w:pPr>
-              <w:spacing w:after="0"/>
+              <w:spacing w:after="0" w:line="240" w:lineRule="auto" w:before="0"/>
             </w:pPr>
             <w:r>
               <w:rPr>
-                <w:rFonts w:ascii="Arial" w:cs="Arial" w:eastAsia="Arial" w:hAnsi="Arial"/>
+                <w:rFonts w:ascii="Times New Roman" w:cs="Times New Roman" w:eastAsia="Times New Roman" w:hAnsi="Times New Roman"/>
+                <w:sz w:val="24"/>
+                <w:szCs w:val="24"/>
               </w:rPr>
               <w:t xml:space="preserve">Web developer (team project)</w:t>
             </w:r>
@@ -207,14 +216,16 @@
           </w:tcPr>
           <w:p>
             <w:pPr>
-              <w:spacing w:after="0"/>
+              <w:spacing w:after="0" w:line="240" w:lineRule="auto" w:before="0"/>
             </w:pPr>
             <w:r>
               <w:rPr>
-                <w:rFonts w:ascii="Arial" w:cs="Arial" w:eastAsia="Arial" w:hAnsi="Arial"/>
+                <w:rFonts w:ascii="Times New Roman" w:cs="Times New Roman" w:eastAsia="Times New Roman" w:hAnsi="Times New Roman"/>
                 <w:b/>
                 <w:bCs/>
                 <w:color w:val="000000"/>
+                <w:sz w:val="24"/>
+                <w:szCs w:val="24"/>
               </w:rPr>
               <w:t xml:space="preserve">Duration</w:t>
             </w:r>
@@ -238,11 +249,13 @@
           </w:tcPr>
           <w:p>
             <w:pPr>
-              <w:spacing w:after="0"/>
+              <w:spacing w:after="0" w:line="240" w:lineRule="auto" w:before="0"/>
             </w:pPr>
             <w:r>
               <w:rPr>
-                <w:rFonts w:ascii="Arial" w:cs="Arial" w:eastAsia="Arial" w:hAnsi="Arial"/>
+                <w:rFonts w:ascii="Times New Roman" w:cs="Times New Roman" w:eastAsia="Times New Roman" w:hAnsi="Times New Roman"/>
+                <w:sz w:val="24"/>
+                <w:szCs w:val="24"/>
               </w:rPr>
               <w:t xml:space="preserve">2025 – 2026</w:t>
             </w:r>
@@ -269,14 +282,16 @@
           </w:tcPr>
           <w:p>
             <w:pPr>
-              <w:spacing w:after="0"/>
+              <w:spacing w:after="0" w:line="240" w:lineRule="auto" w:before="0"/>
             </w:pPr>
             <w:r>
               <w:rPr>
-                <w:rFonts w:ascii="Arial" w:cs="Arial" w:eastAsia="Arial" w:hAnsi="Arial"/>
+                <w:rFonts w:ascii="Times New Roman" w:cs="Times New Roman" w:eastAsia="Times New Roman" w:hAnsi="Times New Roman"/>
                 <w:b/>
                 <w:bCs/>
                 <w:color w:val="000000"/>
+                <w:sz w:val="24"/>
+                <w:szCs w:val="24"/>
               </w:rPr>
               <w:t xml:space="preserve">Status</w:t>
             </w:r>
@@ -300,11 +315,13 @@
           </w:tcPr>
           <w:p>
             <w:pPr>
-              <w:spacing w:after="0"/>
+              <w:spacing w:after="0" w:line="240" w:lineRule="auto" w:before="0"/>
             </w:pPr>
             <w:r>
               <w:rPr>
-                <w:rFonts w:ascii="Arial" w:cs="Arial" w:eastAsia="Arial" w:hAnsi="Arial"/>
+                <w:rFonts w:ascii="Times New Roman" w:cs="Times New Roman" w:eastAsia="Times New Roman" w:hAnsi="Times New Roman"/>
+                <w:sz w:val="24"/>
+                <w:szCs w:val="24"/>
               </w:rPr>
               <w:t xml:space="preserve">Ongoing development</w:t>
             </w:r>
@@ -331,14 +348,16 @@
           </w:tcPr>
           <w:p>
             <w:pPr>
-              <w:spacing w:after="0"/>
+              <w:spacing w:after="0" w:line="240" w:lineRule="auto" w:before="0"/>
             </w:pPr>
             <w:r>
               <w:rPr>
-                <w:rFonts w:ascii="Arial" w:cs="Arial" w:eastAsia="Arial" w:hAnsi="Arial"/>
+                <w:rFonts w:ascii="Times New Roman" w:cs="Times New Roman" w:eastAsia="Times New Roman" w:hAnsi="Times New Roman"/>
                 <w:b/>
                 <w:bCs/>
                 <w:color w:val="000000"/>
+                <w:sz w:val="24"/>
+                <w:szCs w:val="24"/>
               </w:rPr>
               <w:t xml:space="preserve">Focus</w:t>
             </w:r>
@@ -362,11 +381,13 @@
           </w:tcPr>
           <w:p>
             <w:pPr>
-              <w:spacing w:after="0"/>
+              <w:spacing w:after="0" w:line="240" w:lineRule="auto" w:before="0"/>
             </w:pPr>
             <w:r>
               <w:rPr>
-                <w:rFonts w:ascii="Arial" w:cs="Arial" w:eastAsia="Arial" w:hAnsi="Arial"/>
+                <w:rFonts w:ascii="Times New Roman" w:cs="Times New Roman" w:eastAsia="Times New Roman" w:hAnsi="Times New Roman"/>
+                <w:sz w:val="24"/>
+                <w:szCs w:val="24"/>
               </w:rPr>
               <w:t xml:space="preserve">Front end and back end</w:t>
             </w:r>
@@ -376,22 +397,26 @@
     </w:tbl>
     <w:p>
       <w:pPr>
-        <w:spacing w:after="60"/>
-      </w:pPr>
-      <w:r>
-        <w:rPr>
-          <w:rFonts w:ascii="Arial" w:cs="Arial" w:eastAsia="Arial" w:hAnsi="Arial"/>
+        <w:spacing w:after="40" w:line="240" w:lineRule="auto" w:before="0"/>
+      </w:pPr>
+      <w:r>
+        <w:rPr>
+          <w:rFonts w:ascii="Times New Roman" w:cs="Times New Roman" w:eastAsia="Times New Roman" w:hAnsi="Times New Roman"/>
+          <w:sz w:val="24"/>
+          <w:szCs w:val="24"/>
         </w:rPr>
         <w:t xml:space="preserve"/>
       </w:r>
     </w:p>
     <w:p>
       <w:pPr>
-        <w:spacing w:after="60" w:line="276"/>
-      </w:pPr>
-      <w:r>
-        <w:rPr>
-          <w:rFonts w:ascii="Arial" w:cs="Arial" w:eastAsia="Arial" w:hAnsi="Arial"/>
+        <w:spacing w:after="60" w:line="240" w:lineRule="auto" w:before="0"/>
+      </w:pPr>
+      <w:r>
+        <w:rPr>
+          <w:rFonts w:ascii="Times New Roman" w:cs="Times New Roman" w:eastAsia="Times New Roman" w:hAnsi="Times New Roman"/>
+          <w:sz w:val="24"/>
+          <w:szCs w:val="24"/>
         </w:rPr>
         <w:t xml:space="preserve">I contribute as a web developer to this team project, working on both the front end and back end. The system covers point-of-sale and inventory management for Pharxmaco Drugstore and includes sales forecasting in its project scope.</w:t>
         <w:br/>
@@ -401,10 +426,15 @@
     <w:p>
       <w:pPr>
         <w:pStyle w:val="Heading1"/>
-      </w:pPr>
-      <w:r>
-        <w:rPr>
-          <w:rFonts w:ascii="Arial" w:cs="Arial" w:eastAsia="Arial" w:hAnsi="Arial"/>
+        <w:keepNext/>
+        <w:spacing w:line="240" w:lineRule="auto" w:before="180" w:after="80"/>
+      </w:pPr>
+      <w:r>
+        <w:rPr>
+          <w:rFonts w:ascii="Times New Roman" w:cs="Times New Roman" w:eastAsia="Times New Roman" w:hAnsi="Times New Roman"/>
+          <w:b/>
+          <w:sz w:val="24"/>
+          <w:szCs w:val="24"/>
         </w:rPr>
         <w:t xml:space="preserve">Technologies Used</w:t>
       </w:r>
@@ -445,14 +475,16 @@
           </w:tcPr>
           <w:p>
             <w:pPr>
-              <w:spacing w:after="0"/>
+              <w:spacing w:after="0" w:line="240" w:lineRule="auto" w:before="0"/>
             </w:pPr>
             <w:r>
               <w:rPr>
-                <w:rFonts w:ascii="Arial" w:cs="Arial" w:eastAsia="Arial" w:hAnsi="Arial"/>
+                <w:rFonts w:ascii="Times New Roman" w:cs="Times New Roman" w:eastAsia="Times New Roman" w:hAnsi="Times New Roman"/>
                 <w:b/>
                 <w:bCs/>
                 <w:color w:val="000000"/>
+                <w:sz w:val="24"/>
+                <w:szCs w:val="24"/>
               </w:rPr>
               <w:t xml:space="preserve">Back end and database</w:t>
             </w:r>
@@ -476,11 +508,13 @@
           </w:tcPr>
           <w:p>
             <w:pPr>
-              <w:spacing w:after="0"/>
+              <w:spacing w:after="0" w:line="240" w:lineRule="auto" w:before="0"/>
             </w:pPr>
             <w:r>
               <w:rPr>
-                <w:rFonts w:ascii="Arial" w:cs="Arial" w:eastAsia="Arial" w:hAnsi="Arial"/>
+                <w:rFonts w:ascii="Times New Roman" w:cs="Times New Roman" w:eastAsia="Times New Roman" w:hAnsi="Times New Roman"/>
+                <w:sz w:val="24"/>
+                <w:szCs w:val="24"/>
               </w:rPr>
               <w:t xml:space="preserve">PHP, CodeIgniter 4, and MySQL</w:t>
             </w:r>
@@ -507,14 +541,16 @@
           </w:tcPr>
           <w:p>
             <w:pPr>
-              <w:spacing w:after="0"/>
+              <w:spacing w:after="0" w:line="240" w:lineRule="auto" w:before="0"/>
             </w:pPr>
             <w:r>
               <w:rPr>
-                <w:rFonts w:ascii="Arial" w:cs="Arial" w:eastAsia="Arial" w:hAnsi="Arial"/>
+                <w:rFonts w:ascii="Times New Roman" w:cs="Times New Roman" w:eastAsia="Times New Roman" w:hAnsi="Times New Roman"/>
                 <w:b/>
                 <w:bCs/>
                 <w:color w:val="000000"/>
+                <w:sz w:val="24"/>
+                <w:szCs w:val="24"/>
               </w:rPr>
               <w:t xml:space="preserve">Front end</w:t>
             </w:r>
@@ -538,11 +574,13 @@
           </w:tcPr>
           <w:p>
             <w:pPr>
-              <w:spacing w:after="0"/>
+              <w:spacing w:after="0" w:line="240" w:lineRule="auto" w:before="0"/>
             </w:pPr>
             <w:r>
               <w:rPr>
-                <w:rFonts w:ascii="Arial" w:cs="Arial" w:eastAsia="Arial" w:hAnsi="Arial"/>
+                <w:rFonts w:ascii="Times New Roman" w:cs="Times New Roman" w:eastAsia="Times New Roman" w:hAnsi="Times New Roman"/>
+                <w:sz w:val="24"/>
+                <w:szCs w:val="24"/>
               </w:rPr>
               <w:t xml:space="preserve">HTML, CSS, JavaScript, and jQuery/AJAX</w:t>
             </w:r>
@@ -553,10 +591,15 @@
     <w:p>
       <w:pPr>
         <w:pStyle w:val="Heading1"/>
-      </w:pPr>
-      <w:r>
-        <w:rPr>
-          <w:rFonts w:ascii="Arial" w:cs="Arial" w:eastAsia="Arial" w:hAnsi="Arial"/>
+        <w:keepNext/>
+        <w:spacing w:line="240" w:lineRule="auto" w:before="180" w:after="80"/>
+      </w:pPr>
+      <w:r>
+        <w:rPr>
+          <w:rFonts w:ascii="Times New Roman" w:cs="Times New Roman" w:eastAsia="Times New Roman" w:hAnsi="Times New Roman"/>
+          <w:b/>
+          <w:sz w:val="24"/>
+          <w:szCs w:val="24"/>
         </w:rPr>
         <w:t xml:space="preserve">My Contributions</w:t>
       </w:r>
@@ -564,25 +607,29 @@
     <w:p>
       <w:pPr>
         <w:keepNext/>
-        <w:spacing w:after="20" w:before="120"/>
-      </w:pPr>
-      <w:r>
-        <w:rPr>
-          <w:rFonts w:ascii="Arial" w:cs="Arial" w:eastAsia="Arial" w:hAnsi="Arial"/>
+        <w:spacing w:after="20" w:before="80" w:line="240" w:lineRule="auto"/>
+      </w:pPr>
+      <w:r>
+        <w:rPr>
+          <w:rFonts w:ascii="Times New Roman" w:cs="Times New Roman" w:eastAsia="Times New Roman" w:hAnsi="Times New Roman"/>
           <w:b/>
           <w:bCs/>
           <w:color w:val="000000"/>
+          <w:sz w:val="24"/>
+          <w:szCs w:val="24"/>
         </w:rPr>
         <w:t xml:space="preserve">Sales and transactions</w:t>
       </w:r>
     </w:p>
     <w:p>
       <w:pPr>
-        <w:spacing w:after="60" w:line="276"/>
-      </w:pPr>
-      <w:r>
-        <w:rPr>
-          <w:rFonts w:ascii="Arial" w:cs="Arial" w:eastAsia="Arial" w:hAnsi="Arial"/>
+        <w:spacing w:after="60" w:line="240" w:lineRule="auto" w:before="0"/>
+      </w:pPr>
+      <w:r>
+        <w:rPr>
+          <w:rFonts w:ascii="Times New Roman" w:cs="Times New Roman" w:eastAsia="Times New Roman" w:hAnsi="Times New Roman"/>
+          <w:sz w:val="24"/>
+          <w:szCs w:val="24"/>
         </w:rPr>
         <w:t xml:space="preserve">I worked on point-of-sale functions, sales transactions, transaction history, and return/refund processing.</w:t>
       </w:r>
@@ -590,25 +637,29 @@
     <w:p>
       <w:pPr>
         <w:keepNext/>
-        <w:spacing w:after="20" w:before="120"/>
-      </w:pPr>
-      <w:r>
-        <w:rPr>
-          <w:rFonts w:ascii="Arial" w:cs="Arial" w:eastAsia="Arial" w:hAnsi="Arial"/>
+        <w:spacing w:after="20" w:before="80" w:line="240" w:lineRule="auto"/>
+      </w:pPr>
+      <w:r>
+        <w:rPr>
+          <w:rFonts w:ascii="Times New Roman" w:cs="Times New Roman" w:eastAsia="Times New Roman" w:hAnsi="Times New Roman"/>
           <w:b/>
           <w:bCs/>
           <w:color w:val="000000"/>
+          <w:sz w:val="24"/>
+          <w:szCs w:val="24"/>
         </w:rPr>
         <w:t xml:space="preserve">Inventory management</w:t>
       </w:r>
     </w:p>
     <w:p>
       <w:pPr>
-        <w:spacing w:after="60" w:line="276"/>
-      </w:pPr>
-      <w:r>
-        <w:rPr>
-          <w:rFonts w:ascii="Arial" w:cs="Arial" w:eastAsia="Arial" w:hAnsi="Arial"/>
+        <w:spacing w:after="60" w:line="240" w:lineRule="auto" w:before="0"/>
+      </w:pPr>
+      <w:r>
+        <w:rPr>
+          <w:rFonts w:ascii="Times New Roman" w:cs="Times New Roman" w:eastAsia="Times New Roman" w:hAnsi="Times New Roman"/>
+          <w:sz w:val="24"/>
+          <w:szCs w:val="24"/>
         </w:rPr>
         <w:t xml:space="preserve">I contributed to inventory management and automatic stock updates.</w:t>
       </w:r>
@@ -616,25 +667,29 @@
     <w:p>
       <w:pPr>
         <w:keepNext/>
-        <w:spacing w:after="20" w:before="120"/>
-      </w:pPr>
-      <w:r>
-        <w:rPr>
-          <w:rFonts w:ascii="Arial" w:cs="Arial" w:eastAsia="Arial" w:hAnsi="Arial"/>
+        <w:spacing w:after="20" w:before="80" w:line="240" w:lineRule="auto"/>
+      </w:pPr>
+      <w:r>
+        <w:rPr>
+          <w:rFonts w:ascii="Times New Roman" w:cs="Times New Roman" w:eastAsia="Times New Roman" w:hAnsi="Times New Roman"/>
           <w:b/>
           <w:bCs/>
           <w:color w:val="000000"/>
+          <w:sz w:val="24"/>
+          <w:szCs w:val="24"/>
         </w:rPr>
         <w:t xml:space="preserve">User access</w:t>
       </w:r>
     </w:p>
     <w:p>
       <w:pPr>
-        <w:spacing w:after="60" w:line="276"/>
-      </w:pPr>
-      <w:r>
-        <w:rPr>
-          <w:rFonts w:ascii="Arial" w:cs="Arial" w:eastAsia="Arial" w:hAnsi="Arial"/>
+        <w:spacing w:after="60" w:line="240" w:lineRule="auto" w:before="0"/>
+      </w:pPr>
+      <w:r>
+        <w:rPr>
+          <w:rFonts w:ascii="Times New Roman" w:cs="Times New Roman" w:eastAsia="Times New Roman" w:hAnsi="Times New Roman"/>
+          <w:sz w:val="24"/>
+          <w:szCs w:val="24"/>
         </w:rPr>
         <w:t xml:space="preserve">I worked on user authentication and role-based access.</w:t>
       </w:r>
@@ -642,25 +697,29 @@
     <w:p>
       <w:pPr>
         <w:keepNext/>
-        <w:spacing w:after="20" w:before="120"/>
-      </w:pPr>
-      <w:r>
-        <w:rPr>
-          <w:rFonts w:ascii="Arial" w:cs="Arial" w:eastAsia="Arial" w:hAnsi="Arial"/>
+        <w:spacing w:after="20" w:before="80" w:line="240" w:lineRule="auto"/>
+      </w:pPr>
+      <w:r>
+        <w:rPr>
+          <w:rFonts w:ascii="Times New Roman" w:cs="Times New Roman" w:eastAsia="Times New Roman" w:hAnsi="Times New Roman"/>
           <w:b/>
           <w:bCs/>
           <w:color w:val="000000"/>
+          <w:sz w:val="24"/>
+          <w:szCs w:val="24"/>
         </w:rPr>
         <w:t xml:space="preserve">Integration and interface improvements</w:t>
       </w:r>
     </w:p>
     <w:p>
       <w:pPr>
-        <w:spacing w:after="60" w:line="276"/>
-      </w:pPr>
-      <w:r>
-        <w:rPr>
-          <w:rFonts w:ascii="Arial" w:cs="Arial" w:eastAsia="Arial" w:hAnsi="Arial"/>
+        <w:spacing w:after="60" w:line="240" w:lineRule="auto" w:before="0"/>
+      </w:pPr>
+      <w:r>
+        <w:rPr>
+          <w:rFonts w:ascii="Times New Roman" w:cs="Times New Roman" w:eastAsia="Times New Roman" w:hAnsi="Times New Roman"/>
+          <w:sz w:val="24"/>
+          <w:szCs w:val="24"/>
         </w:rPr>
         <w:t xml:space="preserve">I worked on database integration, debugged application issues, and improved the interface.</w:t>
       </w:r>
@@ -668,28 +727,35 @@
     <w:p>
       <w:pPr>
         <w:pStyle w:val="Heading1"/>
-      </w:pPr>
-      <w:r>
-        <w:rPr>
-          <w:rFonts w:ascii="Arial" w:cs="Arial" w:eastAsia="Arial" w:hAnsi="Arial"/>
+        <w:keepNext/>
+        <w:spacing w:line="240" w:lineRule="auto" w:before="180" w:after="80"/>
+      </w:pPr>
+      <w:r>
+        <w:rPr>
+          <w:rFonts w:ascii="Times New Roman" w:cs="Times New Roman" w:eastAsia="Times New Roman" w:hAnsi="Times New Roman"/>
+          <w:b/>
+          <w:sz w:val="24"/>
+          <w:szCs w:val="24"/>
         </w:rPr>
         <w:t xml:space="preserve">Skills Applied</w:t>
       </w:r>
     </w:p>
     <w:p>
       <w:pPr>
-        <w:spacing w:after="0" w:line="276"/>
-      </w:pPr>
-      <w:r>
-        <w:rPr>
-          <w:rFonts w:ascii="Arial" w:cs="Arial" w:eastAsia="Arial" w:hAnsi="Arial"/>
+        <w:spacing w:after="60" w:line="240" w:lineRule="auto" w:before="0"/>
+      </w:pPr>
+      <w:r>
+        <w:rPr>
+          <w:rFonts w:ascii="Times New Roman" w:cs="Times New Roman" w:eastAsia="Times New Roman" w:hAnsi="Times New Roman"/>
+          <w:sz w:val="24"/>
+          <w:szCs w:val="24"/>
         </w:rPr>
         <w:t xml:space="preserve">The project gave me practice in front-end and back-end development, database integration, and debugging. Working on stock updates, transaction history, and refunds required attention to the information handled by the system.</w:t>
       </w:r>
     </w:p>
     <w:sectPr>
       <w:pgSz w:w="12240" w:h="15840" w:orient="portrait"/>
-      <w:pgMar w:top="1080" w:right="1260" w:bottom="1080" w:left="1260" w:header="708" w:footer="708" w:gutter="0"/>
+      <w:pgMar w:top="1008" w:right="1224" w:bottom="936" w:left="1224" w:header="708" w:footer="708" w:gutter="0"/>
       <w:pgNumType/>
       <w:docGrid w:linePitch="360"/>
     </w:sectPr>
@@ -894,6 +960,10 @@
   <w:style w:type="paragraph" w:styleId="Normal" w:default="1">
     <w:name w:val="Normal"/>
     <w:qFormat/>
+    <w:rPr>
+      <w:rFonts w:ascii="Times New Roman" w:hAnsi="Times New Roman" w:eastAsia="Times New Roman"/>
+      <w:sz w:val="24"/>
+    </w:rPr>
   </w:style>
   <w:style w:type="paragraph" w:styleId="Title">
     <w:name w:val="Title"/>
@@ -901,7 +971,8 @@
     <w:next w:val="Normal"/>
     <w:qFormat/>
     <w:rPr>
-      <w:sz w:val="56"/>
+      <w:rFonts w:ascii="Times New Roman" w:hAnsi="Times New Roman" w:eastAsia="Times New Roman"/>
+      <w:sz w:val="24"/>
       <w:szCs w:val="56"/>
     </w:rPr>
   </w:style>
@@ -911,8 +982,9 @@
     <w:next w:val="Normal"/>
     <w:qFormat/>
     <w:rPr>
+      <w:rFonts w:ascii="Times New Roman" w:hAnsi="Times New Roman" w:eastAsia="Times New Roman"/>
       <w:color w:val="2E74B5"/>
-      <w:sz w:val="26"/>
+      <w:sz w:val="24"/>
       <w:szCs w:val="26"/>
     </w:rPr>
   </w:style>
@@ -922,6 +994,7 @@
     <w:next w:val="Normal"/>
     <w:qFormat/>
     <w:rPr>
+      <w:rFonts w:ascii="Times New Roman" w:hAnsi="Times New Roman" w:eastAsia="Times New Roman"/>
       <w:color w:val="1F4D78"/>
       <w:sz w:val="24"/>
       <w:szCs w:val="24"/>
@@ -933,9 +1006,11 @@
     <w:next w:val="Normal"/>
     <w:qFormat/>
     <w:rPr>
+      <w:rFonts w:ascii="Times New Roman" w:hAnsi="Times New Roman" w:eastAsia="Times New Roman"/>
       <w:i/>
       <w:iCs/>
       <w:color w:val="2E74B5"/>
+      <w:sz w:val="24"/>
     </w:rPr>
   </w:style>
   <w:style w:type="paragraph" w:styleId="Heading5">
@@ -944,7 +1019,9 @@
     <w:next w:val="Normal"/>
     <w:qFormat/>
     <w:rPr>
+      <w:rFonts w:ascii="Times New Roman" w:hAnsi="Times New Roman" w:eastAsia="Times New Roman"/>
       <w:color w:val="2E74B5"/>
+      <w:sz w:val="24"/>
     </w:rPr>
   </w:style>
   <w:style w:type="paragraph" w:styleId="Heading6">
@@ -953,7 +1030,9 @@
     <w:next w:val="Normal"/>
     <w:qFormat/>
     <w:rPr>
+      <w:rFonts w:ascii="Times New Roman" w:hAnsi="Times New Roman" w:eastAsia="Times New Roman"/>
       <w:color w:val="1F4D78"/>
+      <w:sz w:val="24"/>
     </w:rPr>
   </w:style>
   <w:style w:type="paragraph" w:styleId="Strong">
@@ -962,14 +1041,20 @@
     <w:next w:val="Normal"/>
     <w:qFormat/>
     <w:rPr>
+      <w:rFonts w:ascii="Times New Roman" w:hAnsi="Times New Roman" w:eastAsia="Times New Roman"/>
       <w:b/>
       <w:bCs/>
+      <w:sz w:val="24"/>
     </w:rPr>
   </w:style>
   <w:style w:type="paragraph" w:styleId="ListParagraph">
     <w:name w:val="List Paragraph"/>
     <w:basedOn w:val="Normal"/>
     <w:qFormat/>
+    <w:rPr>
+      <w:rFonts w:ascii="Times New Roman" w:hAnsi="Times New Roman" w:eastAsia="Times New Roman"/>
+      <w:sz w:val="24"/>
+    </w:rPr>
   </w:style>
   <w:style w:type="character" w:styleId="Hyperlink">
     <w:name w:val="Hyperlink"/>
@@ -977,7 +1062,9 @@
     <w:uiPriority w:val="99"/>
     <w:unhideWhenUsed/>
     <w:rPr>
+      <w:rFonts w:ascii="Times New Roman" w:hAnsi="Times New Roman" w:eastAsia="Times New Roman"/>
       <w:color w:val="0563C1"/>
+      <w:sz w:val="24"/>
       <w:u w:val="single"/>
     </w:rPr>
   </w:style>
@@ -988,6 +1075,8 @@
     <w:semiHidden/>
     <w:unhideWhenUsed/>
     <w:rPr>
+      <w:rFonts w:ascii="Times New Roman" w:hAnsi="Times New Roman" w:eastAsia="Times New Roman"/>
+      <w:sz w:val="24"/>
       <w:vertAlign w:val="superscript"/>
     </w:rPr>
   </w:style>
@@ -1002,7 +1091,8 @@
       <w:spacing w:after="0" w:line="240" w:lineRule="auto"/>
     </w:pPr>
     <w:rPr>
-      <w:sz w:val="20"/>
+      <w:rFonts w:ascii="Times New Roman" w:hAnsi="Times New Roman" w:eastAsia="Times New Roman"/>
+      <w:sz w:val="24"/>
       <w:szCs w:val="20"/>
     </w:rPr>
   </w:style>
@@ -1014,7 +1104,8 @@
     <w:semiHidden/>
     <w:unhideWhenUsed/>
     <w:rPr>
-      <w:sz w:val="20"/>
+      <w:rFonts w:ascii="Times New Roman" w:hAnsi="Times New Roman" w:eastAsia="Times New Roman"/>
+      <w:sz w:val="24"/>
       <w:szCs w:val="20"/>
     </w:rPr>
   </w:style>
@@ -1025,6 +1116,8 @@
     <w:semiHidden/>
     <w:unhideWhenUsed/>
     <w:rPr>
+      <w:rFonts w:ascii="Times New Roman" w:hAnsi="Times New Roman" w:eastAsia="Times New Roman"/>
+      <w:sz w:val="24"/>
       <w:vertAlign w:val="superscript"/>
     </w:rPr>
   </w:style>
@@ -1039,7 +1132,8 @@
       <w:spacing w:after="0" w:line="240" w:lineRule="auto"/>
     </w:pPr>
     <w:rPr>
-      <w:sz w:val="20"/>
+      <w:rFonts w:ascii="Times New Roman" w:hAnsi="Times New Roman" w:eastAsia="Times New Roman"/>
+      <w:sz w:val="24"/>
       <w:szCs w:val="20"/>
     </w:rPr>
   </w:style>
@@ -1051,7 +1145,8 @@
     <w:semiHidden/>
     <w:unhideWhenUsed/>
     <w:rPr>
-      <w:sz w:val="20"/>
+      <w:rFonts w:ascii="Times New Roman" w:hAnsi="Times New Roman" w:eastAsia="Times New Roman"/>
+      <w:sz w:val="24"/>
       <w:szCs w:val="20"/>
     </w:rPr>
   </w:style>
@@ -1069,13 +1164,13 @@
       <w:outlineLvl w:val="0"/>
     </w:pPr>
     <w:rPr>
-      <w:rFonts w:ascii="Arial" w:cs="Arial" w:eastAsia="Arial" w:hAnsi="Arial"/>
+      <w:rFonts w:ascii="Times New Roman" w:cs="Arial" w:eastAsia="Times New Roman" w:hAnsi="Times New Roman"/>
       <w:b/>
       <w:bCs/>
       <w:caps/>
       <w:color w:val="000000"/>
       <w:spacing w:val="20"/>
-      <w:sz w:val="22"/>
+      <w:sz w:val="24"/>
       <w:szCs w:val="22"/>
     </w:rPr>
   </w:style>

</xml_diff>